<commit_message>
Option 2: certification replaces buyer pressure as a condition
- CERT measured as % of EU shipments under GOTS/GRS/RCS/OCS transaction
  certificates (new item B7); buyer pressure becomes a background
  condition, reintroduced in robustness checks R4 and R7
- Propositions recast as owned / negotiated / borrowed routes, P2 as
  substitution, P4 as two circularities; figure, appendix, R and Python
  scripts, simulator and template updated
- Simulated rerun: core mechanisms are trusted capture (DTC*~DAC) and
  borrowed data (CERT); illustrative manuscript and abstract updated

Co-Authored-By: Claude Opus 5.5 <noreply@anthropic.com>
Claude-Session: https://claude.ai/code/session_01SPArV4q8dwhv3Npz3wnuCt
</commit_message>
<xml_diff>
--- a/dpp-textile-jbl/01b_abstract_ILLUSTRATIVE_simulated.docx
+++ b/dpp-textile-jbl/01b_abstract_ILLUSTRATIVE_simulated.docx
@@ -298,7 +298,7 @@
         <w:t xml:space="preserve"> </w:t>
       </w:r>
       <w:r>
-        <w:t xml:space="preserve">Two routes were sufficient for high readiness (solution consistency 0.92, coverage 0.77). In the integrated route, ownership of upstream stages and digital traceability were core. In the networked route, multi-tier data sharing and buyer pressure were core, with low appropriation concern or digital traceability as peripheral conditions. No condition was necessary: digital traceability fell just short (0.89), and certified firms reached readiness with modest systems. Buyer pressure was present among ready and unready firms alike; low readiness combined missing traceability with appropriation concern,</w:t>
+        <w:t xml:space="preserve">Three configurations were sufficient for high readiness (solution consistency 0.92, coverage 0.85). They reduce to two core mechanisms:</w:t>
       </w:r>
       <w:r>
         <w:t xml:space="preserve"> </w:t>
@@ -308,13 +308,29 @@
           <w:iCs/>
           <w:i/>
         </w:rPr>
-        <w:t xml:space="preserve">whatever</w:t>
-      </w:r>
-      <w:r>
-        <w:t xml:space="preserve"> </w:t>
-      </w:r>
-      <w:r>
-        <w:t xml:space="preserve">the pressure. Readiness alone was not sufficient for formal circular practices (consistency 0.52), while informal circularity was widespread regardless of data.</w:t>
+        <w:t xml:space="preserve">trusted capture</w:t>
+      </w:r>
+      <w:r>
+        <w:t xml:space="preserve"> </w:t>
+      </w:r>
+      <w:r>
+        <w:t xml:space="preserve">(digital traceability without data-appropriation concern) and</w:t>
+      </w:r>
+      <w:r>
+        <w:t xml:space="preserve"> </w:t>
+      </w:r>
+      <w:r>
+        <w:rPr>
+          <w:iCs/>
+          <w:i/>
+        </w:rPr>
+        <w:t xml:space="preserve">borrowed data</w:t>
+      </w:r>
+      <w:r>
+        <w:t xml:space="preserve"> </w:t>
+      </w:r>
+      <w:r>
+        <w:t xml:space="preserve">(transaction-certificate coverage under GOTS or GRS). Ownership and supplier sharing appeared only as peripheral conditions; they matter as ways of removing the fear of data misuse. Digital traceability was necessary (0.91), so certificates complemented rather than replaced in-house systems. Buyer pressure was present for 86% of firms and did not distinguish ready from unready firms. Low readiness combined missing traceability or appropriation concern with no certification. Readiness alone was not sufficient for formal circular practice (0.50), which appeared only in integrated, certified recyclers; informal circularity was widespread.</w:t>
       </w:r>
     </w:p>
     <w:p>
@@ -332,7 +348,7 @@
         <w:t xml:space="preserve"> </w:t>
       </w:r>
       <w:r>
-        <w:t xml:space="preserve">Suppliers build passport capacity by owning, negotiating or borrowing access to upstream data. Brands get better passports by limiting how they use supplier data than by pushing harder. Policy should recognise certification data, fund cluster data platforms, and make India’s informal circular economy visible in the passport.</w:t>
+        <w:t xml:space="preserve">Suppliers become passport-ready by capturing data they can reach without fear, or by borrowing it from certification. Brands get better passports by limiting how they use supplier data than by pushing harder. Policy should recognise certification data, fund cluster data platforms, and make India’s informal circular economy visible in the passport.</w:t>
       </w:r>
     </w:p>
     <w:p>

</xml_diff>